<commit_message>
Ispravka SSU-ova 1-5 nakon formalne inspekcije (v1.1)
Change-Id: Id39acdfa6b77568824fc148584292de890f156f1
</commit_message>
<xml_diff>
--- a/faza2/ssu/1. SSU Registracija korisnika.docx
+++ b/faza2/ssu/1. SSU Registracija korisnika.docx
@@ -130,7 +130,7 @@
       <w:tr>
         <w:tc>
           <w:tcPr>
-            <w:tcW w:w="2257" w:type="dxa"/>
+            <w:tcW w:w="2258" w:type="dxa"/>
             <w:tcMar>
               <w:top w:w="100" w:type="dxa"/>
               <w:left w:w="100" w:type="dxa"/>
@@ -240,7 +240,7 @@
       <w:tr>
         <w:tc>
           <w:tcPr>
-            <w:tcW w:w="2257" w:type="dxa"/>
+            <w:tcW w:w="2258" w:type="dxa"/>
             <w:tcMar>
               <w:top w:w="100" w:type="dxa"/>
               <w:left w:w="100" w:type="dxa"/>
@@ -347,6 +347,122 @@
           </w:p>
         </w:tc>
       </w:tr>
+      <w:tr>
+        <w:tc>
+          <w:tcPr>
+            <w:tcW w:w="2258" w:type="dxa"/>
+            <w:tcMar>
+              <w:top w:w="100" w:type="dxa"/>
+              <w:left w:w="100" w:type="dxa"/>
+              <w:bottom w:w="100" w:type="dxa"/>
+              <w:right w:w="100" w:type="dxa"/>
+            </w:tcMar>
+          </w:tcPr>
+          <w:p>
+            <w:pPr>
+              <w:widowControl w:val="0"/>
+              <w:pBdr>
+                <w:top w:val="nil"/>
+                <w:left w:val="nil"/>
+                <w:bottom w:val="nil"/>
+                <w:right w:val="nil"/>
+                <w:between w:val="nil"/>
+              </w:pBdr>
+              <w:spacing w:line="240" w:lineRule="auto"/>
+            </w:pPr>
+            <w:r>
+              <w:t>11.05.2026.</w:t>
+            </w:r>
+          </w:p>
+        </w:tc>
+        <w:tc>
+          <w:tcPr>
+            <w:tcW w:w="2257" w:type="dxa"/>
+            <w:tcMar>
+              <w:top w:w="100" w:type="dxa"/>
+              <w:left w:w="100" w:type="dxa"/>
+              <w:bottom w:w="100" w:type="dxa"/>
+              <w:right w:w="100" w:type="dxa"/>
+            </w:tcMar>
+          </w:tcPr>
+          <w:p>
+            <w:pPr>
+              <w:widowControl w:val="0"/>
+              <w:pBdr>
+                <w:top w:val="nil"/>
+                <w:left w:val="nil"/>
+                <w:bottom w:val="nil"/>
+                <w:right w:val="nil"/>
+                <w:between w:val="nil"/>
+              </w:pBdr>
+              <w:spacing w:line="240" w:lineRule="auto"/>
+            </w:pPr>
+            <w:r>
+              <w:t>1.1</w:t>
+            </w:r>
+          </w:p>
+        </w:tc>
+        <w:tc>
+          <w:tcPr>
+            <w:tcW w:w="2257" w:type="dxa"/>
+            <w:tcMar>
+              <w:top w:w="100" w:type="dxa"/>
+              <w:left w:w="100" w:type="dxa"/>
+              <w:bottom w:w="100" w:type="dxa"/>
+              <w:right w:w="100" w:type="dxa"/>
+            </w:tcMar>
+          </w:tcPr>
+          <w:p>
+            <w:pPr>
+              <w:widowControl w:val="0"/>
+              <w:pBdr>
+                <w:top w:val="nil"/>
+                <w:left w:val="nil"/>
+                <w:bottom w:val="nil"/>
+                <w:right w:val="nil"/>
+                <w:between w:val="nil"/>
+              </w:pBdr>
+              <w:spacing w:line="240" w:lineRule="auto"/>
+            </w:pPr>
+            <w:r>
+              <w:t>Ispravka nakon FR</w:t>
+            </w:r>
+          </w:p>
+        </w:tc>
+        <w:tc>
+          <w:tcPr>
+            <w:tcW w:w="2257" w:type="dxa"/>
+            <w:tcMar>
+              <w:top w:w="100" w:type="dxa"/>
+              <w:left w:w="100" w:type="dxa"/>
+              <w:bottom w:w="100" w:type="dxa"/>
+              <w:right w:w="100" w:type="dxa"/>
+            </w:tcMar>
+          </w:tcPr>
+          <w:p>
+            <w:pPr>
+              <w:widowControl w:val="0"/>
+              <w:pBdr>
+                <w:top w:val="nil"/>
+                <w:left w:val="nil"/>
+                <w:bottom w:val="nil"/>
+                <w:right w:val="nil"/>
+                <w:between w:val="nil"/>
+              </w:pBdr>
+              <w:spacing w:line="240" w:lineRule="auto"/>
+            </w:pPr>
+            <w:r>
+              <w:t xml:space="preserve">Milica </w:t>
+            </w:r>
+            <w:r>
+              <w:t>Štavljani</w:t>
+            </w:r>
+            <w:r>
+              <w:t>n</w:t>
+            </w:r>
+          </w:p>
+        </w:tc>
+      </w:tr>
     </w:tbl>
     <w:p/>
     <w:p/>
@@ -397,7 +513,6 @@
         </w:numPr>
       </w:pPr>
       <w:r>
-        <w:lastRenderedPageBreak/>
         <w:t>Uvod</w:t>
       </w:r>
     </w:p>

</xml_diff>